<commit_message>
toml and zapolnennye placeholders
</commit_message>
<xml_diff>
--- a/defense/docs/reviews/expert/expert_review_1_ru.docx
+++ b/defense/docs/reviews/expert/expert_review_1_ru.docx
@@ -330,7 +330,7 @@
                 <w:sz w:val="28"/>
                 <w:u w:val="none"/>
               </w:rPr>
-              <w:t>Врач-офтальмолог,</w:t>
+              <w:t>Заведующий лазерным отделением, врач-офтальмолог, высшая квалификационная категория, к.м.н.,</w:t>
             </w:r>
           </w:p>
           <w:p>
@@ -371,18 +371,7 @@
                 <w:sz w:val="28"/>
                 <w:u w:val="none"/>
               </w:rPr>
-              <w:t xml:space="preserve">____________  </w:t>
-            </w:r>
-            <w:r>
-              <w:rPr>
-                <w:rFonts w:ascii="Times New Roman" w:hAnsi="Times New Roman" w:cs="Times New Roman" w:eastAsia="Times New Roman"/>
-                <w:b/>
-                <w:i w:val="0"/>
-                <w:sz w:val="28"/>
-                <w:highlight w:val="yellow"/>
-                <w:u w:val="none"/>
-              </w:rPr>
-              <w:t>&lt;Фамилия И.О.&gt;</w:t>
+              <w:t>____________  Үмбетиар А. Б.</w:t>
             </w:r>
           </w:p>
           <w:p>

</xml_diff>